<commit_message>
update of photos and scheduler
</commit_message>
<xml_diff>
--- a/docs/What If You Could Pause a Language Model While It Is Learning v2.docx
+++ b/docs/What If You Could Pause a Language Model While It Is Learning v2.docx
@@ -24,7 +24,23 @@
     </w:p>
     <w:p>
       <w:r>
-        <w:t>There is a gap between understanding the theory and developing a feel for what a model is doing. A learner may know that loss should fall, but not recognise what the model has learned at different points in training. They may know that temperature affects generation, but never compare outputs from the same checkpoint. Before the experiment starts, they may also have to deal with Python environments, GPU drivers and cloud infrastructure.</w:t>
+        <w:t xml:space="preserve">There is a gap between understanding the theory and developing a feel for what a model is doing. A learner may know that loss should </w:t>
+      </w:r>
+      <w:proofErr w:type="gramStart"/>
+      <w:r>
+        <w:t>fall, but</w:t>
+      </w:r>
+      <w:proofErr w:type="gramEnd"/>
+      <w:r>
+        <w:t xml:space="preserve"> not recognise what the model has learned at different points in training. They may know that temperature affects </w:t>
+      </w:r>
+      <w:proofErr w:type="gramStart"/>
+      <w:r>
+        <w:t>generation, but</w:t>
+      </w:r>
+      <w:proofErr w:type="gramEnd"/>
+      <w:r>
+        <w:t xml:space="preserve"> never compare outputs from the same checkpoint. Before the experiment starts, they may also have to deal with Python environments, GPU drivers and cloud infrastructure.</w:t>
       </w:r>
     </w:p>
     <w:p>
@@ -48,7 +64,15 @@
       </w:r>
       <w:proofErr w:type="spellEnd"/>
       <w:r>
-        <w:t xml:space="preserve"> Academy AI Performance Engineering course, a demanding 14 week programme which I recently completed.</w:t>
+        <w:t xml:space="preserve"> Academy AI Performance Engineering course, a demanding </w:t>
+      </w:r>
+      <w:proofErr w:type="gramStart"/>
+      <w:r>
+        <w:t>14 week</w:t>
+      </w:r>
+      <w:proofErr w:type="gramEnd"/>
+      <w:r>
+        <w:t xml:space="preserve"> programme which I recently completed.</w:t>
       </w:r>
     </w:p>
     <w:p>
@@ -113,14 +137,18 @@
         <w:t>The application is not intended to replace notebooks. It creates a guided step between theory and unrestricted code.</w:t>
       </w:r>
     </w:p>
-    <w:p>
-      <w:r>
+    <w:p/>
+    <w:p>
+      <w:r>
+        <w:rPr>
+          <w:noProof/>
+        </w:rPr>
         <w:lastRenderedPageBreak/>
         <w:drawing>
-          <wp:inline distT="0" distB="0" distL="0" distR="0" wp14:anchorId="49BA9B8D" wp14:editId="16C4AE42">
-            <wp:extent cx="5592673" cy="3171825"/>
-            <wp:effectExtent l="0" t="0" r="8255" b="0"/>
-            <wp:docPr id="752941831" name="Picture 1" descr="A screenshot of a computer&#10;&#10;AI-generated content may be incorrect."/>
+          <wp:inline distT="0" distB="0" distL="0" distR="0" wp14:anchorId="15708F0F" wp14:editId="32C26490">
+            <wp:extent cx="5731510" cy="3362325"/>
+            <wp:effectExtent l="0" t="0" r="2540" b="9525"/>
+            <wp:docPr id="1449720449" name="Picture 3" descr="A screenshot of a computer&#10;&#10;AI-generated content may be incorrect."/>
             <wp:cNvGraphicFramePr>
               <a:graphicFrameLocks xmlns:a="http://schemas.openxmlformats.org/drawingml/2006/main" noChangeAspect="1"/>
             </wp:cNvGraphicFramePr>
@@ -128,11 +156,17 @@
               <a:graphicData uri="http://schemas.openxmlformats.org/drawingml/2006/picture">
                 <pic:pic xmlns:pic="http://schemas.openxmlformats.org/drawingml/2006/picture">
                   <pic:nvPicPr>
-                    <pic:cNvPr id="752941831" name="Picture 1" descr="A screenshot of a computer&#10;&#10;AI-generated content may be incorrect."/>
+                    <pic:cNvPr id="1449720449" name="Picture 3" descr="A screenshot of a computer&#10;&#10;AI-generated content may be incorrect."/>
                     <pic:cNvPicPr/>
                   </pic:nvPicPr>
                   <pic:blipFill>
-                    <a:blip r:embed="rId4"/>
+                    <a:blip r:embed="rId4" cstate="print">
+                      <a:extLst>
+                        <a:ext uri="{28A0092B-C50C-407E-A947-70E740481C1C}">
+                          <a14:useLocalDpi xmlns:a14="http://schemas.microsoft.com/office/drawing/2010/main" val="0"/>
+                        </a:ext>
+                      </a:extLst>
+                    </a:blip>
                     <a:stretch>
                       <a:fillRect/>
                     </a:stretch>
@@ -140,7 +174,7 @@
                   <pic:spPr>
                     <a:xfrm>
                       <a:off x="0" y="0"/>
-                      <a:ext cx="5613687" cy="3183743"/>
+                      <a:ext cx="5731510" cy="3362325"/>
                     </a:xfrm>
                     <a:prstGeom prst="rect">
                       <a:avLst/>
@@ -196,10 +230,37 @@
           <w:sz w:val="20"/>
           <w:szCs w:val="20"/>
         </w:rPr>
-        <w:t>React/Vite Dashboard showing config, training curves, prompt box,  and attention maps</w:t>
-      </w:r>
-    </w:p>
-    <w:p/>
+        <w:t xml:space="preserve">React/Vite Dashboard showing config, training curves, prompt </w:t>
+      </w:r>
+      <w:proofErr w:type="gramStart"/>
+      <w:r>
+        <w:rPr>
+          <w:b/>
+          <w:bCs/>
+          <w:sz w:val="20"/>
+          <w:szCs w:val="20"/>
+        </w:rPr>
+        <w:t>box,  and</w:t>
+      </w:r>
+      <w:proofErr w:type="gramEnd"/>
+      <w:r>
+        <w:rPr>
+          <w:b/>
+          <w:bCs/>
+          <w:sz w:val="20"/>
+          <w:szCs w:val="20"/>
+        </w:rPr>
+        <w:t xml:space="preserve"> attention maps</w:t>
+      </w:r>
+    </w:p>
+    <w:p>
+      <w:pPr>
+        <w:rPr>
+          <w:b/>
+          <w:bCs/>
+        </w:rPr>
+      </w:pPr>
+    </w:p>
     <w:p>
       <w:r>
         <w:rPr>
@@ -235,7 +296,6 @@
         <w:t>Architecture and lifecycle diagrams are shown below</w:t>
       </w:r>
     </w:p>
-    <w:p/>
     <w:p>
       <w:r>
         <w:rPr>
@@ -305,9 +365,6 @@
     </w:p>
     <w:p/>
     <w:p>
-      <w:pPr>
-        <w:ind w:left="2160"/>
-      </w:pPr>
       <w:r>
         <w:rPr>
           <w:noProof/>
@@ -513,7 +570,7 @@
           <w:sz w:val="20"/>
           <w:szCs w:val="20"/>
         </w:rPr>
-        <w:t xml:space="preserve"> </w:t>
+        <w:t xml:space="preserve"> Figure </w:t>
       </w:r>
       <w:r>
         <w:rPr>
@@ -522,7 +579,7 @@
           <w:sz w:val="20"/>
           <w:szCs w:val="20"/>
         </w:rPr>
-        <w:t xml:space="preserve">Figure </w:t>
+        <w:t>3</w:t>
       </w:r>
       <w:r>
         <w:rPr>
@@ -531,7 +588,7 @@
           <w:sz w:val="20"/>
           <w:szCs w:val="20"/>
         </w:rPr>
-        <w:t>3</w:t>
+        <w:t>: T</w:t>
       </w:r>
       <w:r>
         <w:rPr>
@@ -540,15 +597,6 @@
           <w:sz w:val="20"/>
           <w:szCs w:val="20"/>
         </w:rPr>
-        <w:t>: T</w:t>
-      </w:r>
-      <w:r>
-        <w:rPr>
-          <w:b/>
-          <w:bCs/>
-          <w:sz w:val="20"/>
-          <w:szCs w:val="20"/>
-        </w:rPr>
         <w:t>raining Lifecycle</w:t>
       </w:r>
     </w:p>
@@ -756,6 +804,7 @@
         <w:rPr>
           <w:b/>
           <w:bCs/>
+          <w:noProof/>
           <w:sz w:val="20"/>
           <w:szCs w:val="20"/>
         </w:rPr>
@@ -836,6 +885,9 @@
     <w:p/>
     <w:p>
       <w:r>
+        <w:rPr>
+          <w:noProof/>
+        </w:rPr>
         <w:lastRenderedPageBreak/>
         <w:drawing>
           <wp:inline distT="0" distB="0" distL="0" distR="0" wp14:anchorId="16481CD5" wp14:editId="6786E53A">
@@ -1013,10 +1065,12 @@
       </w:r>
     </w:p>
     <w:p>
+      <w:bookmarkStart w:id="0" w:name="OLE_LINK1"/>
       <w:r>
         <w:t>#NebiusServerlessChallenge</w:t>
       </w:r>
     </w:p>
+    <w:bookmarkEnd w:id="0"/>
     <w:p>
       <w:proofErr w:type="spellStart"/>
       <w:r>
@@ -1026,9 +1080,11 @@
       <w:r>
         <w:t xml:space="preserve"> repo: </w:t>
       </w:r>
+      <w:bookmarkStart w:id="1" w:name="OLE_LINK2"/>
       <w:r>
         <w:t>https://github.com/NnamdiOdozi/llm_experiments_lab/</w:t>
       </w:r>
+      <w:bookmarkEnd w:id="1"/>
     </w:p>
     <w:p/>
     <w:p/>
@@ -1646,6 +1702,7 @@
   <w:style w:type="character" w:default="1" w:styleId="DefaultParagraphFont">
     <w:name w:val="Default Paragraph Font"/>
     <w:uiPriority w:val="1"/>
+    <w:semiHidden/>
     <w:unhideWhenUsed/>
   </w:style>
   <w:style w:type="table" w:default="1" w:styleId="TableNormal">

</xml_diff>